<commit_message>
docs: add detailed documentation for headless Workforce Identity Federation migration and troubleshooting procedures
</commit_message>
<xml_diff>
--- a/USER_GUIDE.docx
+++ b/USER_GUIDE.docx
@@ -96,7 +96,7 @@
                 <w:sz w:val="19"/>
                 <w:szCs w:val="19"/>
               </w:rPr>
-              <w:t xml:space="preserve">v1.5.3 (Enterprise Release)</w:t>
+              <w:t xml:space="preserve">v1.5.5 (Enterprise Release)</w:t>
             </w:r>
           </w:p>
         </w:tc>
@@ -4233,7 +4233,7 @@
         <w:spacing w:after="120" w:before="280"/>
       </w:pPr>
       <w:r>
-        <w:t xml:space="preserve">9.2 Workforce Identity Federation (WiF) — Keyless Enterprise Path</w:t>
+        <w:t xml:space="preserve">9.2 Workforce Identity Federation (WiF) — Keyless Enterprise Path &amp; Architecture</w:t>
       </w:r>
     </w:p>
     <w:p>
@@ -4323,16 +4323,16 @@
           <w:sz w:val="21"/>
           <w:szCs w:val="21"/>
         </w:rPr>
-        <w:t xml:space="preserve">Truthful Live SA Impersonation Verification (`generateAccessToken`)</w:t>
-      </w:r>
-      <w:r>
-        <w:rPr>
-          <w:rFonts w:ascii="Arial" w:cs="Arial" w:eastAsia="Arial" w:hAnsi="Arial"/>
-          <w:color w:val="1E293B"/>
-          <w:sz w:val="21"/>
-          <w:szCs w:val="21"/>
-        </w:rPr>
-        <w:t xml:space="preserve">: When testing WiF impersonation (</w:t>
+        <w:t xml:space="preserve">The Headless Migration Provider Pattern (`migration-dwd-provider`)</w:t>
+      </w:r>
+      <w:r>
+        <w:rPr>
+          <w:rFonts w:ascii="Arial" w:cs="Arial" w:eastAsia="Arial" w:hAnsi="Arial"/>
+          <w:color w:val="1E293B"/>
+          <w:sz w:val="21"/>
+          <w:szCs w:val="21"/>
+        </w:rPr>
+        <w:t xml:space="preserve">: Standard Okta/Entra providers require interactive logins and MFA redirects. To enable automated bulk migration without passwords, the platform registers a dedicated OIDC provider (</w:t>
       </w:r>
       <w:r>
         <w:rPr>
@@ -4342,36 +4342,16 @@
           <w:szCs w:val="19"/>
           <w:shd w:fill="F1F5F9"/>
         </w:rPr>
-        <w:t xml:space="preserve">/api/wizard/test-wif</w:t>
-      </w:r>
-      <w:r>
-        <w:rPr>
-          <w:rFonts w:ascii="Arial" w:cs="Arial" w:eastAsia="Arial" w:hAnsi="Arial"/>
-          <w:color w:val="1E293B"/>
-          <w:sz w:val="21"/>
-          <w:szCs w:val="21"/>
-        </w:rPr>
-        <w:t xml:space="preserve">), the console performs a live token exchange against the </w:t>
-      </w:r>
-      <w:r>
-        <w:rPr>
-          <w:rFonts w:ascii="Arial" w:cs="Arial" w:eastAsia="Arial" w:hAnsi="Arial"/>
-          <w:b/>
-          <w:bCs/>
-          <w:color w:val="0F172A"/>
-          <w:sz w:val="21"/>
-          <w:szCs w:val="21"/>
-        </w:rPr>
-        <w:t xml:space="preserve">Google Cloud IAM Credentials API</w:t>
-      </w:r>
-      <w:r>
-        <w:rPr>
-          <w:rFonts w:ascii="Arial" w:cs="Arial" w:eastAsia="Arial" w:hAnsi="Arial"/>
-          <w:color w:val="1E293B"/>
-          <w:sz w:val="21"/>
-          <w:szCs w:val="21"/>
-        </w:rPr>
-        <w:t xml:space="preserve"> (</w:t>
+        <w:t xml:space="preserve">migration-dwd-provider</w:t>
+      </w:r>
+      <w:r>
+        <w:rPr>
+          <w:rFonts w:ascii="Arial" w:cs="Arial" w:eastAsia="Arial" w:hAnsi="Arial"/>
+          <w:color w:val="1E293B"/>
+          <w:sz w:val="21"/>
+          <w:szCs w:val="21"/>
+        </w:rPr>
+        <w:t xml:space="preserve">) directly inside the customer's existing Workforce Identity Pool using a local RSA keypair (</w:t>
       </w:r>
       <w:r>
         <w:rPr>
@@ -4381,16 +4361,16 @@
           <w:szCs w:val="19"/>
           <w:shd w:fill="F1F5F9"/>
         </w:rPr>
-        <w:t xml:space="preserve">serviceAccounts.generateAccessToken</w:t>
-      </w:r>
-      <w:r>
-        <w:rPr>
-          <w:rFonts w:ascii="Arial" w:cs="Arial" w:eastAsia="Arial" w:hAnsi="Arial"/>
-          <w:color w:val="1E293B"/>
-          <w:sz w:val="21"/>
-          <w:szCs w:val="21"/>
-        </w:rPr>
-        <w:t xml:space="preserve">). If the caller or workforce pool lacks </w:t>
+        <w:t xml:space="preserve">wif-migration-key.pem</w:t>
+      </w:r>
+      <w:r>
+        <w:rPr>
+          <w:rFonts w:ascii="Arial" w:cs="Arial" w:eastAsia="Arial" w:hAnsi="Arial"/>
+          <w:color w:val="1E293B"/>
+          <w:sz w:val="21"/>
+          <w:szCs w:val="21"/>
+        </w:rPr>
+        <w:t xml:space="preserve"> and </w:t>
       </w:r>
       <w:r>
         <w:rPr>
@@ -4400,16 +4380,16 @@
           <w:szCs w:val="19"/>
           <w:shd w:fill="F1F5F9"/>
         </w:rPr>
-        <w:t xml:space="preserve">roles/iam.serviceAccountTokenCreator</w:t>
-      </w:r>
-      <w:r>
-        <w:rPr>
-          <w:rFonts w:ascii="Arial" w:cs="Arial" w:eastAsia="Arial" w:hAnsi="Arial"/>
-          <w:color w:val="1E293B"/>
-          <w:sz w:val="21"/>
-          <w:szCs w:val="21"/>
-        </w:rPr>
-        <w:t xml:space="preserve"> on the target service account, the test fails truthfully with actionable error context rather than simulating success.</w:t>
+        <w:t xml:space="preserve">wif-migration-jwks.json</w:t>
+      </w:r>
+      <w:r>
+        <w:rPr>
+          <w:rFonts w:ascii="Arial" w:cs="Arial" w:eastAsia="Arial" w:hAnsi="Arial"/>
+          <w:color w:val="1E293B"/>
+          <w:sz w:val="21"/>
+          <w:szCs w:val="21"/>
+        </w:rPr>
+        <w:t xml:space="preserve">).</w:t>
       </w:r>
     </w:p>
     <w:p>
@@ -4430,16 +4410,36 @@
           <w:sz w:val="21"/>
           <w:szCs w:val="21"/>
         </w:rPr>
-        <w:t xml:space="preserve">Domain Sharing Validation</w:t>
-      </w:r>
-      <w:r>
-        <w:rPr>
-          <w:rFonts w:ascii="Arial" w:cs="Arial" w:eastAsia="Arial" w:hAnsi="Arial"/>
-          <w:color w:val="1E293B"/>
-          <w:sz w:val="21"/>
-          <w:szCs w:val="21"/>
-        </w:rPr>
-        <w:t xml:space="preserve">: Verifies that </w:t>
+        <w:t xml:space="preserve">Direct Workforce User Tokens vs. Service Account Impersonation</w:t>
+      </w:r>
+      <w:r>
+        <w:rPr>
+          <w:rFonts w:ascii="Arial" w:cs="Arial" w:eastAsia="Arial" w:hAnsi="Arial"/>
+          <w:color w:val="1E293B"/>
+          <w:sz w:val="21"/>
+          <w:szCs w:val="21"/>
+        </w:rPr>
+        <w:t xml:space="preserve">: User-owned assets (NotebookLM notebooks, personalized memories, and chat sessions) </w:t>
+      </w:r>
+      <w:r>
+        <w:rPr>
+          <w:rFonts w:ascii="Arial" w:cs="Arial" w:eastAsia="Arial" w:hAnsi="Arial"/>
+          <w:b/>
+          <w:bCs/>
+          <w:color w:val="0F172A"/>
+          <w:sz w:val="21"/>
+          <w:szCs w:val="21"/>
+        </w:rPr>
+        <w:t xml:space="preserve">cannot</w:t>
+      </w:r>
+      <w:r>
+        <w:rPr>
+          <w:rFonts w:ascii="Arial" w:cs="Arial" w:eastAsia="Arial" w:hAnsi="Arial"/>
+          <w:color w:val="1E293B"/>
+          <w:sz w:val="21"/>
+          <w:szCs w:val="21"/>
+        </w:rPr>
+        <w:t xml:space="preserve"> be accessed by a Service Account (</w:t>
       </w:r>
       <w:r>
         <w:rPr>
@@ -4449,16 +4449,16 @@
           <w:szCs w:val="19"/>
           <w:shd w:fill="F1F5F9"/>
         </w:rPr>
-        <w:t xml:space="preserve">iam.allowedPolicyMemberDomains</w:t>
-      </w:r>
-      <w:r>
-        <w:rPr>
-          <w:rFonts w:ascii="Arial" w:cs="Arial" w:eastAsia="Arial" w:hAnsi="Arial"/>
-          <w:color w:val="1E293B"/>
-          <w:sz w:val="21"/>
-          <w:szCs w:val="21"/>
-        </w:rPr>
-        <w:t xml:space="preserve"> permits workforce pool principals (</w:t>
+        <w:t xml:space="preserve">gemini-dwd-migrator@...</w:t>
+      </w:r>
+      <w:r>
+        <w:rPr>
+          <w:rFonts w:ascii="Arial" w:cs="Arial" w:eastAsia="Arial" w:hAnsi="Arial"/>
+          <w:color w:val="1E293B"/>
+          <w:sz w:val="21"/>
+          <w:szCs w:val="21"/>
+        </w:rPr>
+        <w:t xml:space="preserve">). The migration engine calls Discovery Engine APIs (</w:t>
       </w:r>
       <w:r>
         <w:rPr>
@@ -4468,16 +4468,55 @@
           <w:szCs w:val="19"/>
           <w:shd w:fill="F1F5F9"/>
         </w:rPr>
-        <w:t xml:space="preserve">is:principalSet://iam.googleapis.com/organizations/&lt;org-id&gt;</w:t>
-      </w:r>
-      <w:r>
-        <w:rPr>
-          <w:rFonts w:ascii="Arial" w:cs="Arial" w:eastAsia="Arial" w:hAnsi="Arial"/>
-          <w:color w:val="1E293B"/>
-          <w:sz w:val="21"/>
-          <w:szCs w:val="21"/>
-        </w:rPr>
-        <w:t xml:space="preserve">).</w:t>
+        <w:t xml:space="preserve">notebooks:listRecentlyViewed</w:t>
+      </w:r>
+      <w:r>
+        <w:rPr>
+          <w:rFonts w:ascii="Arial" w:cs="Arial" w:eastAsia="Arial" w:hAnsi="Arial"/>
+          <w:color w:val="1E293B"/>
+          <w:sz w:val="21"/>
+          <w:szCs w:val="21"/>
+        </w:rPr>
+        <w:t xml:space="preserve">) </w:t>
+      </w:r>
+      <w:r>
+        <w:rPr>
+          <w:rFonts w:ascii="Arial" w:cs="Arial" w:eastAsia="Arial" w:hAnsi="Arial"/>
+          <w:b/>
+          <w:bCs/>
+          <w:color w:val="0F172A"/>
+          <w:sz w:val="21"/>
+          <w:szCs w:val="21"/>
+        </w:rPr>
+        <w:t xml:space="preserve">directly using the minted Workforce User STS token</w:t>
+      </w:r>
+      <w:r>
+        <w:rPr>
+          <w:rFonts w:ascii="Arial" w:cs="Arial" w:eastAsia="Arial" w:hAnsi="Arial"/>
+          <w:color w:val="1E293B"/>
+          <w:sz w:val="21"/>
+          <w:szCs w:val="21"/>
+        </w:rPr>
+        <w:t xml:space="preserve"> (</w:t>
+      </w:r>
+      <w:r>
+        <w:rPr>
+          <w:rFonts w:ascii="Consolas" w:cs="Consolas" w:eastAsia="Consolas" w:hAnsi="Consolas"/>
+          <w:color w:val="0F172A"/>
+          <w:sz w:val="19"/>
+          <w:szCs w:val="19"/>
+          <w:shd w:fill="F1F5F9"/>
+        </w:rPr>
+        <w:t xml:space="preserve">principal://.../subject/&lt;USER&gt;</w:t>
+      </w:r>
+      <w:r>
+        <w:rPr>
+          <w:rFonts w:ascii="Arial" w:cs="Arial" w:eastAsia="Arial" w:hAnsi="Arial"/>
+          <w:color w:val="1E293B"/>
+          <w:sz w:val="21"/>
+          <w:szCs w:val="21"/>
+        </w:rPr>
+        <w:t xml:space="preserve">). Service Account impersonation is optional and reserved for administrative infrastructure APIs.</w:t>
       </w:r>
     </w:p>
     <w:p>
@@ -4498,25 +4537,130 @@
           <w:sz w:val="21"/>
           <w:szCs w:val="21"/>
         </w:rPr>
-        <w:t xml:space="preserve">Live GCP Verification</w:t>
-      </w:r>
-      <w:r>
-        <w:rPr>
-          <w:rFonts w:ascii="Arial" w:cs="Arial" w:eastAsia="Arial" w:hAnsi="Arial"/>
-          <w:color w:val="1E293B"/>
-          <w:sz w:val="21"/>
-          <w:szCs w:val="21"/>
-        </w:rPr>
-        <w:t xml:space="preserve">: The Verify Live in GCP button tests workforce pools and OIDC providers directly in Google Cloud.</w:t>
-      </w:r>
-    </w:p>
-    <w:p>
-      <w:pPr>
-        <w:pStyle w:val="Heading2"/>
-        <w:spacing w:after="120" w:before="280"/>
-      </w:pPr>
-      <w:r>
-        <w:t xml:space="preserve">9.3 Permissions &amp; Least-Privilege Auditor</w:t>
+        <w:t xml:space="preserve">`google.subject` &amp; `google.groups` Parity Architecture</w:t>
+      </w:r>
+      <w:r>
+        <w:rPr>
+          <w:rFonts w:ascii="Arial" w:cs="Arial" w:eastAsia="Arial" w:hAnsi="Arial"/>
+          <w:color w:val="1E293B"/>
+          <w:sz w:val="21"/>
+          <w:szCs w:val="21"/>
+        </w:rPr>
+        <w:t xml:space="preserve">: The migration provider must construct the identical principal as the production provider (e.g. </w:t>
+      </w:r>
+      <w:r>
+        <w:rPr>
+          <w:rFonts w:ascii="Consolas" w:cs="Consolas" w:eastAsia="Consolas" w:hAnsi="Consolas"/>
+          <w:color w:val="0F172A"/>
+          <w:sz w:val="19"/>
+          <w:szCs w:val="19"/>
+          <w:shd w:fill="F1F5F9"/>
+        </w:rPr>
+        <w:t xml:space="preserve">google.subject = assertion.email.lowerAscii()</w:t>
+      </w:r>
+      <w:r>
+        <w:rPr>
+          <w:rFonts w:ascii="Arial" w:cs="Arial" w:eastAsia="Arial" w:hAnsi="Arial"/>
+          <w:color w:val="1E293B"/>
+          <w:sz w:val="21"/>
+          <w:szCs w:val="21"/>
+        </w:rPr>
+        <w:t xml:space="preserve">). If the provider lacks </w:t>
+      </w:r>
+      <w:r>
+        <w:rPr>
+          <w:rFonts w:ascii="Consolas" w:cs="Consolas" w:eastAsia="Consolas" w:hAnsi="Consolas"/>
+          <w:color w:val="0F172A"/>
+          <w:sz w:val="19"/>
+          <w:szCs w:val="19"/>
+          <w:shd w:fill="F1F5F9"/>
+        </w:rPr>
+        <w:t xml:space="preserve">.lowerAscii()</w:t>
+      </w:r>
+      <w:r>
+        <w:rPr>
+          <w:rFonts w:ascii="Arial" w:cs="Arial" w:eastAsia="Arial" w:hAnsi="Arial"/>
+          <w:color w:val="1E293B"/>
+          <w:sz w:val="21"/>
+          <w:szCs w:val="21"/>
+        </w:rPr>
+        <w:t xml:space="preserve"> or misses </w:t>
+      </w:r>
+      <w:r>
+        <w:rPr>
+          <w:rFonts w:ascii="Consolas" w:cs="Consolas" w:eastAsia="Consolas" w:hAnsi="Consolas"/>
+          <w:color w:val="0F172A"/>
+          <w:sz w:val="19"/>
+          <w:szCs w:val="19"/>
+          <w:shd w:fill="F1F5F9"/>
+        </w:rPr>
+        <w:t xml:space="preserve">google.groups = assertion.groups</w:t>
+      </w:r>
+      <w:r>
+        <w:rPr>
+          <w:rFonts w:ascii="Arial" w:cs="Arial" w:eastAsia="Arial" w:hAnsi="Arial"/>
+          <w:color w:val="1E293B"/>
+          <w:sz w:val="21"/>
+          <w:szCs w:val="21"/>
+        </w:rPr>
+        <w:t xml:space="preserve">, user calls fail with </w:t>
+      </w:r>
+      <w:r>
+        <w:rPr>
+          <w:rFonts w:ascii="Consolas" w:cs="Consolas" w:eastAsia="Consolas" w:hAnsi="Consolas"/>
+          <w:color w:val="0F172A"/>
+          <w:sz w:val="19"/>
+          <w:szCs w:val="19"/>
+          <w:shd w:fill="F1F5F9"/>
+        </w:rPr>
+        <w:t xml:space="preserve">HTTP 403: Permission discoveryengine.notebooks.list denied</w:t>
+      </w:r>
+      <w:r>
+        <w:rPr>
+          <w:rFonts w:ascii="Arial" w:cs="Arial" w:eastAsia="Arial" w:hAnsi="Arial"/>
+          <w:color w:val="1E293B"/>
+          <w:sz w:val="21"/>
+          <w:szCs w:val="21"/>
+        </w:rPr>
+        <w:t xml:space="preserve">. SAML </w:t>
+      </w:r>
+      <w:r>
+        <w:rPr>
+          <w:rFonts w:ascii="Consolas" w:cs="Consolas" w:eastAsia="Consolas" w:hAnsi="Consolas"/>
+          <w:color w:val="0F172A"/>
+          <w:sz w:val="19"/>
+          <w:szCs w:val="19"/>
+          <w:shd w:fill="F1F5F9"/>
+        </w:rPr>
+        <w:t xml:space="preserve">assertion.subject.lowerAscii()</w:t>
+      </w:r>
+      <w:r>
+        <w:rPr>
+          <w:rFonts w:ascii="Arial" w:cs="Arial" w:eastAsia="Arial" w:hAnsi="Arial"/>
+          <w:color w:val="1E293B"/>
+          <w:sz w:val="21"/>
+          <w:szCs w:val="21"/>
+        </w:rPr>
+        <w:t xml:space="preserve"> and OIDC </w:t>
+      </w:r>
+      <w:r>
+        <w:rPr>
+          <w:rFonts w:ascii="Consolas" w:cs="Consolas" w:eastAsia="Consolas" w:hAnsi="Consolas"/>
+          <w:color w:val="0F172A"/>
+          <w:sz w:val="19"/>
+          <w:szCs w:val="19"/>
+          <w:shd w:fill="F1F5F9"/>
+        </w:rPr>
+        <w:t xml:space="preserve">assertion.email.lowerAscii()</w:t>
+      </w:r>
+      <w:r>
+        <w:rPr>
+          <w:rFonts w:ascii="Arial" w:cs="Arial" w:eastAsia="Arial" w:hAnsi="Arial"/>
+          <w:color w:val="1E293B"/>
+          <w:sz w:val="21"/>
+          <w:szCs w:val="21"/>
+        </w:rPr>
+        <w:t xml:space="preserve"> are semantically equivalent.</w:t>
       </w:r>
     </w:p>
     <w:p>
@@ -4531,11 +4675,79 @@
       <w:r>
         <w:rPr>
           <w:rFonts w:ascii="Arial" w:cs="Arial" w:eastAsia="Arial" w:hAnsi="Arial"/>
-          <w:color w:val="1E293B"/>
-          <w:sz w:val="21"/>
-          <w:szCs w:val="21"/>
-        </w:rPr>
-        <w:t xml:space="preserve">Evaluates Discovery Engine read/write scopes, NotebookLM source access, and Gmail API dispatch scopes.</w:t>
+          <w:b/>
+          <w:bCs/>
+          <w:color w:val="0F172A"/>
+          <w:sz w:val="21"/>
+          <w:szCs w:val="21"/>
+        </w:rPr>
+        <w:t xml:space="preserve">Automated GE App Workforce Discovery</w:t>
+      </w:r>
+      <w:r>
+        <w:rPr>
+          <w:rFonts w:ascii="Arial" w:cs="Arial" w:eastAsia="Arial" w:hAnsi="Arial"/>
+          <w:color w:val="1E293B"/>
+          <w:sz w:val="21"/>
+          <w:szCs w:val="21"/>
+        </w:rPr>
+        <w:t xml:space="preserve">: The Wizard automatically inspects Discovery Engine </w:t>
+      </w:r>
+      <w:r>
+        <w:rPr>
+          <w:rFonts w:ascii="Consolas" w:cs="Consolas" w:eastAsia="Consolas" w:hAnsi="Consolas"/>
+          <w:color w:val="0F172A"/>
+          <w:sz w:val="19"/>
+          <w:szCs w:val="19"/>
+          <w:shd w:fill="F1F5F9"/>
+        </w:rPr>
+        <w:t xml:space="preserve">aclConfig</w:t>
+      </w:r>
+      <w:r>
+        <w:rPr>
+          <w:rFonts w:ascii="Arial" w:cs="Arial" w:eastAsia="Arial" w:hAnsi="Arial"/>
+          <w:color w:val="1E293B"/>
+          <w:sz w:val="21"/>
+          <w:szCs w:val="21"/>
+        </w:rPr>
+        <w:t xml:space="preserve"> and project IAM policies to detect production pools, discover group bindings, and auto-align the </w:t>
+      </w:r>
+      <w:r>
+        <w:rPr>
+          <w:rFonts w:ascii="Consolas" w:cs="Consolas" w:eastAsia="Consolas" w:hAnsi="Consolas"/>
+          <w:color w:val="0F172A"/>
+          <w:sz w:val="19"/>
+          <w:szCs w:val="19"/>
+          <w:shd w:fill="F1F5F9"/>
+        </w:rPr>
+        <w:t xml:space="preserve">--attribute-mapping</w:t>
+      </w:r>
+      <w:r>
+        <w:rPr>
+          <w:rFonts w:ascii="Arial" w:cs="Arial" w:eastAsia="Arial" w:hAnsi="Arial"/>
+          <w:color w:val="1E293B"/>
+          <w:sz w:val="21"/>
+          <w:szCs w:val="21"/>
+        </w:rPr>
+        <w:t xml:space="preserve"> string via 1-click </w:t>
+      </w:r>
+      <w:r>
+        <w:rPr>
+          <w:rFonts w:ascii="Consolas" w:cs="Consolas" w:eastAsia="Consolas" w:hAnsi="Consolas"/>
+          <w:color w:val="0F172A"/>
+          <w:sz w:val="19"/>
+          <w:szCs w:val="19"/>
+          <w:shd w:fill="F1F5F9"/>
+        </w:rPr>
+        <w:t xml:space="preserve">update-oidc</w:t>
+      </w:r>
+      <w:r>
+        <w:rPr>
+          <w:rFonts w:ascii="Arial" w:cs="Arial" w:eastAsia="Arial" w:hAnsi="Arial"/>
+          <w:color w:val="1E293B"/>
+          <w:sz w:val="21"/>
+          <w:szCs w:val="21"/>
+        </w:rPr>
+        <w:t xml:space="preserve">.</w:t>
       </w:r>
     </w:p>
     <w:p>
@@ -4550,11 +4762,41 @@
       <w:r>
         <w:rPr>
           <w:rFonts w:ascii="Arial" w:cs="Arial" w:eastAsia="Arial" w:hAnsi="Arial"/>
-          <w:color w:val="1E293B"/>
-          <w:sz w:val="21"/>
-          <w:szCs w:val="21"/>
-        </w:rPr>
-        <w:t xml:space="preserve">Flags over-provisioned permissions or destructive deletion privileges.</w:t>
+          <w:b/>
+          <w:bCs/>
+          <w:color w:val="0F172A"/>
+          <w:sz w:val="21"/>
+          <w:szCs w:val="21"/>
+        </w:rPr>
+        <w:t xml:space="preserve">Stateless Federation &amp; Wildcard IAM Pool Bindings</w:t>
+      </w:r>
+      <w:r>
+        <w:rPr>
+          <w:rFonts w:ascii="Arial" w:cs="Arial" w:eastAsia="Arial" w:hAnsi="Arial"/>
+          <w:color w:val="1E293B"/>
+          <w:sz w:val="21"/>
+          <w:szCs w:val="21"/>
+        </w:rPr>
+        <w:t xml:space="preserve">: GCP STS validates the RSA JWKS locally without contacting Okta/Entra. In sandbox projects with pool-wide wildcard IAM bindings (</w:t>
+      </w:r>
+      <w:r>
+        <w:rPr>
+          <w:rFonts w:ascii="Consolas" w:cs="Consolas" w:eastAsia="Consolas" w:hAnsi="Consolas"/>
+          <w:color w:val="0F172A"/>
+          <w:sz w:val="19"/>
+          <w:szCs w:val="19"/>
+          <w:shd w:fill="F1F5F9"/>
+        </w:rPr>
+        <w:t xml:space="preserve">workforcePools/&lt;POOL&gt;/*</w:t>
+      </w:r>
+      <w:r>
+        <w:rPr>
+          <w:rFonts w:ascii="Arial" w:cs="Arial" w:eastAsia="Arial" w:hAnsi="Arial"/>
+          <w:color w:val="1E293B"/>
+          <w:sz w:val="21"/>
+          <w:szCs w:val="21"/>
+        </w:rPr>
+        <w:t xml:space="preserve">), any email returns 200 OK with 0 notebooks. Step 4 displays an amber warning when 0 notebooks are returned to remind operators to test a user who owns &gt;= 1 notebook.</w:t>
       </w:r>
     </w:p>
     <w:p>
@@ -4569,11 +4811,50 @@
       <w:r>
         <w:rPr>
           <w:rFonts w:ascii="Arial" w:cs="Arial" w:eastAsia="Arial" w:hAnsi="Arial"/>
-          <w:color w:val="1E293B"/>
-          <w:sz w:val="21"/>
-          <w:szCs w:val="21"/>
-        </w:rPr>
-        <w:t xml:space="preserve">Runs automated organization policy compliance audits on the target project.</w:t>
+          <w:b/>
+          <w:bCs/>
+          <w:color w:val="0F172A"/>
+          <w:sz w:val="21"/>
+          <w:szCs w:val="21"/>
+        </w:rPr>
+        <w:t xml:space="preserve">3-Stage End-to-End Live Verification</w:t>
+      </w:r>
+      <w:r>
+        <w:rPr>
+          <w:rFonts w:ascii="Arial" w:cs="Arial" w:eastAsia="Arial" w:hAnsi="Arial"/>
+          <w:color w:val="1E293B"/>
+          <w:sz w:val="21"/>
+          <w:szCs w:val="21"/>
+        </w:rPr>
+        <w:t xml:space="preserve">: Step 4 tests (1) STS Token Minting, (2) Subject Mapping Parity, and (3) Live User Notebooks API Probe (</w:t>
+      </w:r>
+      <w:r>
+        <w:rPr>
+          <w:rFonts w:ascii="Consolas" w:cs="Consolas" w:eastAsia="Consolas" w:hAnsi="Consolas"/>
+          <w:color w:val="0F172A"/>
+          <w:sz w:val="19"/>
+          <w:szCs w:val="19"/>
+          <w:shd w:fill="F1F5F9"/>
+        </w:rPr>
+        <w:t xml:space="preserve">discoveryengine.notebooks.list</w:t>
+      </w:r>
+      <w:r>
+        <w:rPr>
+          <w:rFonts w:ascii="Arial" w:cs="Arial" w:eastAsia="Arial" w:hAnsi="Arial"/>
+          <w:color w:val="1E293B"/>
+          <w:sz w:val="21"/>
+          <w:szCs w:val="21"/>
+        </w:rPr>
+        <w:t xml:space="preserve">) as the target user.</w:t>
+      </w:r>
+    </w:p>
+    <w:p>
+      <w:pPr>
+        <w:pStyle w:val="Heading2"/>
+        <w:spacing w:after="120" w:before="280"/>
+      </w:pPr>
+      <w:r>
+        <w:t xml:space="preserve">9.3 Permissions &amp; Least-Privilege Auditor</w:t>
       </w:r>
     </w:p>
     <w:p>
@@ -4592,8 +4873,586 @@
           <w:sz w:val="21"/>
           <w:szCs w:val="21"/>
         </w:rPr>
+        <w:t xml:space="preserve">Evaluates Discovery Engine read/write scopes, NotebookLM source access, and Gmail API dispatch scopes.</w:t>
+      </w:r>
+    </w:p>
+    <w:p>
+      <w:pPr>
+        <w:pStyle w:val="ListParagraph"/>
+        <w:numPr>
+          <w:ilvl w:val="0"/>
+          <w:numId w:val="1"/>
+        </w:numPr>
+        <w:spacing w:after="60" w:line="260"/>
+      </w:pPr>
+      <w:r>
+        <w:rPr>
+          <w:rFonts w:ascii="Arial" w:cs="Arial" w:eastAsia="Arial" w:hAnsi="Arial"/>
+          <w:color w:val="1E293B"/>
+          <w:sz w:val="21"/>
+          <w:szCs w:val="21"/>
+        </w:rPr>
+        <w:t xml:space="preserve">Flags over-provisioned permissions or destructive deletion privileges.</w:t>
+      </w:r>
+    </w:p>
+    <w:p>
+      <w:pPr>
+        <w:pStyle w:val="ListParagraph"/>
+        <w:numPr>
+          <w:ilvl w:val="0"/>
+          <w:numId w:val="1"/>
+        </w:numPr>
+        <w:spacing w:after="60" w:line="260"/>
+      </w:pPr>
+      <w:r>
+        <w:rPr>
+          <w:rFonts w:ascii="Arial" w:cs="Arial" w:eastAsia="Arial" w:hAnsi="Arial"/>
+          <w:color w:val="1E293B"/>
+          <w:sz w:val="21"/>
+          <w:szCs w:val="21"/>
+        </w:rPr>
+        <w:t xml:space="preserve">Runs automated organization policy compliance audits on the target project.</w:t>
+      </w:r>
+    </w:p>
+    <w:p>
+      <w:pPr>
+        <w:pStyle w:val="ListParagraph"/>
+        <w:numPr>
+          <w:ilvl w:val="0"/>
+          <w:numId w:val="1"/>
+        </w:numPr>
+        <w:spacing w:after="60" w:line="260"/>
+      </w:pPr>
+      <w:r>
+        <w:rPr>
+          <w:rFonts w:ascii="Arial" w:cs="Arial" w:eastAsia="Arial" w:hAnsi="Arial"/>
+          <w:color w:val="1E293B"/>
+          <w:sz w:val="21"/>
+          <w:szCs w:val="21"/>
+        </w:rPr>
         <w:t xml:space="preserve">Offers 1-click IAM policy bindings auto-fixes for missing roles.</w:t>
       </w:r>
+    </w:p>
+    <w:p>
+      <w:pPr>
+        <w:pStyle w:val="Heading2"/>
+        <w:spacing w:after="120" w:before="280"/>
+      </w:pPr>
+      <w:r>
+        <w:t xml:space="preserve">9.4 Troubleshooting Guide &amp; Enterprise Error Remediations</w:t>
+      </w:r>
+    </w:p>
+    <w:tbl>
+      <w:tblPr>
+        <w:tblW w:type="pct" w:w="100%"/>
+        <w:tblBorders>
+          <w:top w:val="single" w:color="CBD5E1" w:sz="1"/>
+          <w:left w:val="single" w:color="CBD5E1" w:sz="1"/>
+          <w:bottom w:val="single" w:color="CBD5E1" w:sz="1"/>
+          <w:right w:val="single" w:color="CBD5E1" w:sz="1"/>
+          <w:insideH w:val="single" w:color="E2E8F0" w:sz="1"/>
+          <w:insideV w:val="single" w:color="E2E8F0" w:sz="1"/>
+        </w:tblBorders>
+      </w:tblPr>
+      <w:tblGrid>
+        <w:gridCol w:w="100"/>
+        <w:gridCol w:w="100"/>
+        <w:gridCol w:w="100"/>
+      </w:tblGrid>
+      <w:tr>
+        <w:trPr>
+          <w:tblHeader/>
+        </w:trPr>
+        <w:tc>
+          <w:tcPr>
+            <w:tcW w:type="pct" w:w="30%"/>
+            <w:shd w:fill="1E293B"/>
+            <w:tcMar>
+              <w:top w:type="dxa" w:w="100"/>
+              <w:left w:type="dxa" w:w="140"/>
+              <w:bottom w:type="dxa" w:w="100"/>
+              <w:right w:type="dxa" w:w="140"/>
+            </w:tcMar>
+          </w:tcPr>
+          <w:p>
+            <w:pPr>
+              <w:spacing w:after="40"/>
+            </w:pPr>
+            <w:r>
+              <w:rPr>
+                <w:rFonts w:ascii="Arial" w:cs="Arial" w:eastAsia="Arial" w:hAnsi="Arial"/>
+                <w:b/>
+                <w:bCs/>
+                <w:color w:val="FFFFFF"/>
+                <w:sz w:val="19"/>
+                <w:szCs w:val="19"/>
+              </w:rPr>
+              <w:t xml:space="preserve">Error / Symptom</w:t>
+            </w:r>
+          </w:p>
+        </w:tc>
+        <w:tc>
+          <w:tcPr>
+            <w:tcW w:type="pct" w:w="30%"/>
+            <w:shd w:fill="1E293B"/>
+            <w:tcMar>
+              <w:top w:type="dxa" w:w="100"/>
+              <w:left w:type="dxa" w:w="140"/>
+              <w:bottom w:type="dxa" w:w="100"/>
+              <w:right w:type="dxa" w:w="140"/>
+            </w:tcMar>
+          </w:tcPr>
+          <w:p>
+            <w:pPr>
+              <w:spacing w:after="40"/>
+            </w:pPr>
+            <w:r>
+              <w:rPr>
+                <w:rFonts w:ascii="Arial" w:cs="Arial" w:eastAsia="Arial" w:hAnsi="Arial"/>
+                <w:b/>
+                <w:bCs/>
+                <w:color w:val="FFFFFF"/>
+                <w:sz w:val="19"/>
+                <w:szCs w:val="19"/>
+              </w:rPr>
+              <w:t xml:space="preserve">Root Cause</w:t>
+            </w:r>
+          </w:p>
+        </w:tc>
+        <w:tc>
+          <w:tcPr>
+            <w:tcW w:type="pct" w:w="40%"/>
+            <w:shd w:fill="1E293B"/>
+            <w:tcMar>
+              <w:top w:type="dxa" w:w="100"/>
+              <w:left w:type="dxa" w:w="140"/>
+              <w:bottom w:type="dxa" w:w="100"/>
+              <w:right w:type="dxa" w:w="140"/>
+            </w:tcMar>
+          </w:tcPr>
+          <w:p>
+            <w:pPr>
+              <w:spacing w:after="40"/>
+            </w:pPr>
+            <w:r>
+              <w:rPr>
+                <w:rFonts w:ascii="Arial" w:cs="Arial" w:eastAsia="Arial" w:hAnsi="Arial"/>
+                <w:b/>
+                <w:bCs/>
+                <w:color w:val="FFFFFF"/>
+                <w:sz w:val="19"/>
+                <w:szCs w:val="19"/>
+              </w:rPr>
+              <w:t xml:space="preserve">Actionable Resolution</w:t>
+            </w:r>
+          </w:p>
+        </w:tc>
+      </w:tr>
+      <w:tr>
+        <w:tc>
+          <w:tcPr>
+            <w:tcW w:type="pct" w:w="30%"/>
+            <w:shd w:fill="FFFFFF"/>
+            <w:tcMar>
+              <w:top w:type="dxa" w:w="80"/>
+              <w:left w:type="dxa" w:w="140"/>
+              <w:bottom w:type="dxa" w:w="80"/>
+              <w:right w:type="dxa" w:w="140"/>
+            </w:tcMar>
+          </w:tcPr>
+          <w:p>
+            <w:pPr>
+              <w:spacing w:after="40"/>
+            </w:pPr>
+            <w:r>
+              <w:rPr>
+                <w:rFonts w:ascii="Arial" w:cs="Arial" w:eastAsia="Arial" w:hAnsi="Arial"/>
+                <w:color w:val="1E293B"/>
+                <w:sz w:val="21"/>
+                <w:szCs w:val="21"/>
+              </w:rPr>
+              <w:t xml:space="preserve">Permission discoveryengine.notebooks.list denied (HTTP 403)</w:t>
+            </w:r>
+          </w:p>
+        </w:tc>
+        <w:tc>
+          <w:tcPr>
+            <w:tcW w:type="pct" w:w="30%"/>
+            <w:shd w:fill="FFFFFF"/>
+            <w:tcMar>
+              <w:top w:type="dxa" w:w="80"/>
+              <w:left w:type="dxa" w:w="140"/>
+              <w:bottom w:type="dxa" w:w="80"/>
+              <w:right w:type="dxa" w:w="140"/>
+            </w:tcMar>
+          </w:tcPr>
+          <w:p>
+            <w:pPr>
+              <w:spacing w:after="40"/>
+            </w:pPr>
+            <w:r>
+              <w:rPr>
+                <w:rFonts w:ascii="Arial" w:cs="Arial" w:eastAsia="Arial" w:hAnsi="Arial"/>
+                <w:color w:val="1E293B"/>
+                <w:sz w:val="21"/>
+                <w:szCs w:val="21"/>
+              </w:rPr>
+              <w:t xml:space="preserve">Mismatched google.subject (missing .lowerAscii()), missing google.groups claim, or user lacks roles/discoveryengine.user</w:t>
+            </w:r>
+          </w:p>
+        </w:tc>
+        <w:tc>
+          <w:tcPr>
+            <w:tcW w:type="pct" w:w="40%"/>
+            <w:shd w:fill="FFFFFF"/>
+            <w:tcMar>
+              <w:top w:type="dxa" w:w="80"/>
+              <w:left w:type="dxa" w:w="140"/>
+              <w:bottom w:type="dxa" w:w="80"/>
+              <w:right w:type="dxa" w:w="140"/>
+            </w:tcMar>
+          </w:tcPr>
+          <w:p>
+            <w:pPr>
+              <w:spacing w:after="40"/>
+            </w:pPr>
+            <w:r>
+              <w:rPr>
+                <w:rFonts w:ascii="Arial" w:cs="Arial" w:eastAsia="Arial" w:hAnsi="Arial"/>
+                <w:color w:val="1E293B"/>
+                <w:sz w:val="21"/>
+                <w:szCs w:val="21"/>
+              </w:rPr>
+              <w:t xml:space="preserve">1. Align provider: gcloud iam workforce-pools providers update-oidc migration-dwd-provider --attribute-mapping="google.subject=assertion.email.lowerAscii(),google.groups=assertion.groups,attribute.user_email=assertion.email". 2. Grant roles/discoveryengine.user and serviceusage.serviceUsageConsumer.</w:t>
+            </w:r>
+          </w:p>
+        </w:tc>
+      </w:tr>
+      <w:tr>
+        <w:tc>
+          <w:tcPr>
+            <w:tcW w:type="pct" w:w="30%"/>
+            <w:shd w:fill="F8FAFC"/>
+            <w:tcMar>
+              <w:top w:type="dxa" w:w="80"/>
+              <w:left w:type="dxa" w:w="140"/>
+              <w:bottom w:type="dxa" w:w="80"/>
+              <w:right w:type="dxa" w:w="140"/>
+            </w:tcMar>
+          </w:tcPr>
+          <w:p>
+            <w:pPr>
+              <w:spacing w:after="40"/>
+            </w:pPr>
+            <w:r>
+              <w:rPr>
+                <w:rFonts w:ascii="Arial" w:cs="Arial" w:eastAsia="Arial" w:hAnsi="Arial"/>
+                <w:color w:val="1E293B"/>
+                <w:sz w:val="21"/>
+                <w:szCs w:val="21"/>
+              </w:rPr>
+              <w:t xml:space="preserve">WorkforceSubjectMappingMismatch</w:t>
+            </w:r>
+          </w:p>
+        </w:tc>
+        <w:tc>
+          <w:tcPr>
+            <w:tcW w:type="pct" w:w="30%"/>
+            <w:shd w:fill="F8FAFC"/>
+            <w:tcMar>
+              <w:top w:type="dxa" w:w="80"/>
+              <w:left w:type="dxa" w:w="140"/>
+              <w:bottom w:type="dxa" w:w="80"/>
+              <w:right w:type="dxa" w:w="140"/>
+            </w:tcMar>
+          </w:tcPr>
+          <w:p>
+            <w:pPr>
+              <w:spacing w:after="40"/>
+            </w:pPr>
+            <w:r>
+              <w:rPr>
+                <w:rFonts w:ascii="Arial" w:cs="Arial" w:eastAsia="Arial" w:hAnsi="Arial"/>
+                <w:color w:val="1E293B"/>
+                <w:sz w:val="21"/>
+                <w:szCs w:val="21"/>
+              </w:rPr>
+              <w:t xml:space="preserve">Pool contains multiple providers with differing subject CEL expressions</w:t>
+            </w:r>
+          </w:p>
+        </w:tc>
+        <w:tc>
+          <w:tcPr>
+            <w:tcW w:type="pct" w:w="40%"/>
+            <w:shd w:fill="F8FAFC"/>
+            <w:tcMar>
+              <w:top w:type="dxa" w:w="80"/>
+              <w:left w:type="dxa" w:w="140"/>
+              <w:bottom w:type="dxa" w:w="80"/>
+              <w:right w:type="dxa" w:w="140"/>
+            </w:tcMar>
+          </w:tcPr>
+          <w:p>
+            <w:pPr>
+              <w:spacing w:after="40"/>
+            </w:pPr>
+            <w:r>
+              <w:rPr>
+                <w:rFonts w:ascii="Arial" w:cs="Arial" w:eastAsia="Arial" w:hAnsi="Arial"/>
+                <w:color w:val="1E293B"/>
+                <w:sz w:val="21"/>
+                <w:szCs w:val="21"/>
+              </w:rPr>
+              <w:t xml:space="preserve">Update migration-dwd-provider to match the canonical lowercase email format (assertion.email.lowerAscii()). The validator treats OIDC and SAML lowercase email mappings as semantically aligned.</w:t>
+            </w:r>
+          </w:p>
+        </w:tc>
+      </w:tr>
+      <w:tr>
+        <w:tc>
+          <w:tcPr>
+            <w:tcW w:type="pct" w:w="30%"/>
+            <w:shd w:fill="FFFFFF"/>
+            <w:tcMar>
+              <w:top w:type="dxa" w:w="80"/>
+              <w:left w:type="dxa" w:w="140"/>
+              <w:bottom w:type="dxa" w:w="80"/>
+              <w:right w:type="dxa" w:w="140"/>
+            </w:tcMar>
+          </w:tcPr>
+          <w:p>
+            <w:pPr>
+              <w:spacing w:after="40"/>
+            </w:pPr>
+            <w:r>
+              <w:rPr>
+                <w:rFonts w:ascii="Arial" w:cs="Arial" w:eastAsia="Arial" w:hAnsi="Arial"/>
+                <w:color w:val="1E293B"/>
+                <w:sz w:val="21"/>
+                <w:szCs w:val="21"/>
+              </w:rPr>
+              <w:t xml:space="preserve">The issuer in ID Token does not match...</w:t>
+            </w:r>
+          </w:p>
+        </w:tc>
+        <w:tc>
+          <w:tcPr>
+            <w:tcW w:type="pct" w:w="30%"/>
+            <w:shd w:fill="FFFFFF"/>
+            <w:tcMar>
+              <w:top w:type="dxa" w:w="80"/>
+              <w:left w:type="dxa" w:w="140"/>
+              <w:bottom w:type="dxa" w:w="80"/>
+              <w:right w:type="dxa" w:w="140"/>
+            </w:tcMar>
+          </w:tcPr>
+          <w:p>
+            <w:pPr>
+              <w:spacing w:after="40"/>
+            </w:pPr>
+            <w:r>
+              <w:rPr>
+                <w:rFonts w:ascii="Arial" w:cs="Arial" w:eastAsia="Arial" w:hAnsi="Arial"/>
+                <w:color w:val="1E293B"/>
+                <w:sz w:val="21"/>
+                <w:szCs w:val="21"/>
+              </w:rPr>
+              <w:t xml:space="preserve">Configuration points to an interactive production provider instead of headless migration-dwd-provider</w:t>
+            </w:r>
+          </w:p>
+        </w:tc>
+        <w:tc>
+          <w:tcPr>
+            <w:tcW w:type="pct" w:w="40%"/>
+            <w:shd w:fill="FFFFFF"/>
+            <w:tcMar>
+              <w:top w:type="dxa" w:w="80"/>
+              <w:left w:type="dxa" w:w="140"/>
+              <w:bottom w:type="dxa" w:w="80"/>
+              <w:right w:type="dxa" w:w="140"/>
+            </w:tcMar>
+          </w:tcPr>
+          <w:p>
+            <w:pPr>
+              <w:spacing w:after="40"/>
+            </w:pPr>
+            <w:r>
+              <w:rPr>
+                <w:rFonts w:ascii="Arial" w:cs="Arial" w:eastAsia="Arial" w:hAnsi="Arial"/>
+                <w:color w:val="1E293B"/>
+                <w:sz w:val="21"/>
+                <w:szCs w:val="21"/>
+              </w:rPr>
+              <w:t xml:space="preserve">Select Migration DWD preset in Auth Wizard, or set providerId to migration-dwd-provider and issuer to https://gemini-migration.internal.</w:t>
+            </w:r>
+          </w:p>
+        </w:tc>
+      </w:tr>
+      <w:tr>
+        <w:tc>
+          <w:tcPr>
+            <w:tcW w:type="pct" w:w="30%"/>
+            <w:shd w:fill="F8FAFC"/>
+            <w:tcMar>
+              <w:top w:type="dxa" w:w="80"/>
+              <w:left w:type="dxa" w:w="140"/>
+              <w:bottom w:type="dxa" w:w="80"/>
+              <w:right w:type="dxa" w:w="140"/>
+            </w:tcMar>
+          </w:tcPr>
+          <w:p>
+            <w:pPr>
+              <w:spacing w:after="40"/>
+            </w:pPr>
+            <w:r>
+              <w:rPr>
+                <w:rFonts w:ascii="Arial" w:cs="Arial" w:eastAsia="Arial" w:hAnsi="Arial"/>
+                <w:color w:val="1E293B"/>
+                <w:sz w:val="21"/>
+                <w:szCs w:val="21"/>
+              </w:rPr>
+              <w:t xml:space="preserve">USER_PROJECT_DENIED / serviceusage</w:t>
+            </w:r>
+          </w:p>
+        </w:tc>
+        <w:tc>
+          <w:tcPr>
+            <w:tcW w:type="pct" w:w="30%"/>
+            <w:shd w:fill="F8FAFC"/>
+            <w:tcMar>
+              <w:top w:type="dxa" w:w="80"/>
+              <w:left w:type="dxa" w:w="140"/>
+              <w:bottom w:type="dxa" w:w="80"/>
+              <w:right w:type="dxa" w:w="140"/>
+            </w:tcMar>
+          </w:tcPr>
+          <w:p>
+            <w:pPr>
+              <w:spacing w:after="40"/>
+            </w:pPr>
+            <w:r>
+              <w:rPr>
+                <w:rFonts w:ascii="Arial" w:cs="Arial" w:eastAsia="Arial" w:hAnsi="Arial"/>
+                <w:color w:val="1E293B"/>
+                <w:sz w:val="21"/>
+                <w:szCs w:val="21"/>
+              </w:rPr>
+              <w:t xml:space="preserve">Workforce principal or SA not authorized on quota project</w:t>
+            </w:r>
+          </w:p>
+        </w:tc>
+        <w:tc>
+          <w:tcPr>
+            <w:tcW w:type="pct" w:w="40%"/>
+            <w:shd w:fill="F8FAFC"/>
+            <w:tcMar>
+              <w:top w:type="dxa" w:w="80"/>
+              <w:left w:type="dxa" w:w="140"/>
+              <w:bottom w:type="dxa" w:w="80"/>
+              <w:right w:type="dxa" w:w="140"/>
+            </w:tcMar>
+          </w:tcPr>
+          <w:p>
+            <w:pPr>
+              <w:spacing w:after="40"/>
+            </w:pPr>
+            <w:r>
+              <w:rPr>
+                <w:rFonts w:ascii="Arial" w:cs="Arial" w:eastAsia="Arial" w:hAnsi="Arial"/>
+                <w:color w:val="1E293B"/>
+                <w:sz w:val="21"/>
+                <w:szCs w:val="21"/>
+              </w:rPr>
+              <w:t xml:space="preserve">Grant roles/serviceusage.serviceUsageConsumer to the workforce principal or pool.</w:t>
+            </w:r>
+          </w:p>
+        </w:tc>
+      </w:tr>
+      <w:tr>
+        <w:tc>
+          <w:tcPr>
+            <w:tcW w:type="pct" w:w="30%"/>
+            <w:shd w:fill="FFFFFF"/>
+            <w:tcMar>
+              <w:top w:type="dxa" w:w="80"/>
+              <w:left w:type="dxa" w:w="140"/>
+              <w:bottom w:type="dxa" w:w="80"/>
+              <w:right w:type="dxa" w:w="140"/>
+            </w:tcMar>
+          </w:tcPr>
+          <w:p>
+            <w:pPr>
+              <w:spacing w:after="40"/>
+            </w:pPr>
+            <w:r>
+              <w:rPr>
+                <w:rFonts w:ascii="Arial" w:cs="Arial" w:eastAsia="Arial" w:hAnsi="Arial"/>
+                <w:color w:val="1E293B"/>
+                <w:sz w:val="21"/>
+                <w:szCs w:val="21"/>
+              </w:rPr>
+              <w:t xml:space="preserve">invalid_grant: Invalid email or User ID</w:t>
+            </w:r>
+          </w:p>
+        </w:tc>
+        <w:tc>
+          <w:tcPr>
+            <w:tcW w:type="pct" w:w="30%"/>
+            <w:shd w:fill="FFFFFF"/>
+            <w:tcMar>
+              <w:top w:type="dxa" w:w="80"/>
+              <w:left w:type="dxa" w:w="140"/>
+              <w:bottom w:type="dxa" w:w="80"/>
+              <w:right w:type="dxa" w:w="140"/>
+            </w:tcMar>
+          </w:tcPr>
+          <w:p>
+            <w:pPr>
+              <w:spacing w:after="40"/>
+            </w:pPr>
+            <w:r>
+              <w:rPr>
+                <w:rFonts w:ascii="Arial" w:cs="Arial" w:eastAsia="Arial" w:hAnsi="Arial"/>
+                <w:color w:val="1E293B"/>
+                <w:sz w:val="21"/>
+                <w:szCs w:val="21"/>
+              </w:rPr>
+              <w:t xml:space="preserve">Target user does not exist in Google Workspace directory</w:t>
+            </w:r>
+          </w:p>
+        </w:tc>
+        <w:tc>
+          <w:tcPr>
+            <w:tcW w:type="pct" w:w="40%"/>
+            <w:shd w:fill="FFFFFF"/>
+            <w:tcMar>
+              <w:top w:type="dxa" w:w="80"/>
+              <w:left w:type="dxa" w:w="140"/>
+              <w:bottom w:type="dxa" w:w="80"/>
+              <w:right w:type="dxa" w:w="140"/>
+            </w:tcMar>
+          </w:tcPr>
+          <w:p>
+            <w:pPr>
+              <w:spacing w:after="40"/>
+            </w:pPr>
+            <w:r>
+              <w:rPr>
+                <w:rFonts w:ascii="Arial" w:cs="Arial" w:eastAsia="Arial" w:hAnsi="Arial"/>
+                <w:color w:val="1E293B"/>
+                <w:sz w:val="21"/>
+                <w:szCs w:val="21"/>
+              </w:rPr>
+              <w:t xml:space="preserve">Verify target user exists in admin.google.com, or configure Cross-IdP transformation rules in Step 3.</w:t>
+            </w:r>
+          </w:p>
+        </w:tc>
+      </w:tr>
+    </w:tbl>
+    <w:p>
+      <w:pPr>
+        <w:spacing w:after="160"/>
+      </w:pPr>
     </w:p>
     <w:p>
       <w:pPr>

</xml_diff>